<commit_message>
Ajustes emisión de Riesgos técnicos
</commit_message>
<xml_diff>
--- a/Reportes/EDS001_MQ.docx
+++ b/Reportes/EDS001_MQ.docx
@@ -1,51 +1,5 @@
 
-<file path=docProps\app.xml><?xml version="1.0" encoding="utf-8"?>
-<Properties xmlns="http://schemas.openxmlformats.org/officeDocument/2006/extended-properties" xmlns:vt="http://schemas.openxmlformats.org/officeDocument/2006/docPropsVTypes">
-  <Template>Normal.dotm</Template>
-  <TotalTime>0</TotalTime>
-  <Pages>2</Pages>
-  <Words>782</Words>
-  <Characters>4307</Characters>
-  <Application>Microsoft Office Word</Application>
-  <DocSecurity>4</DocSecurity>
-  <Lines>35</Lines>
-  <Paragraphs>10</Paragraphs>
-  <ScaleCrop>false</ScaleCrop>
-  <Company>Crystal Decisions</Company>
-  <LinksUpToDate>false</LinksUpToDate>
-  <CharactersWithSpaces>5079</CharactersWithSpaces>
-  <SharedDoc>false</SharedDoc>
-  <HyperlinksChanged>false</HyperlinksChanged>
-  <AppVersion>16.0000</AppVersion>
-</Properties>
-</file>
-
-<file path=docProps\core.xml><?xml version="1.0" encoding="utf-8"?>
-<cp:coreProperties xmlns:cp="http://schemas.openxmlformats.org/package/2006/metadata/core-properties" xmlns:dc="http://purl.org/dc/elements/1.1/" xmlns:dcterms="http://purl.org/dc/terms/" xmlns:dcmitype="http://purl.org/dc/dcmitype/" xmlns:xsi="http://www.w3.org/2001/XMLSchema-instance">
-  <dc:title/>
-  <dc:subject/>
-  <dc:creator>Crystal Reports</dc:creator>
-  <cp:keywords/>
-  <dc:description>Powered By Crystal</dc:description>
-  <cp:lastModifiedBy>Michael Antonio Delgado Castro</cp:lastModifiedBy>
-  <cp:revision>2</cp:revision>
-  <dcterms:created xsi:type="dcterms:W3CDTF">2026-09-25T01:08:00Z</dcterms:created>
-  <dcterms:modified xsi:type="dcterms:W3CDTF">2026-09-25T01:08:00Z</dcterms:modified>
-</cp:coreProperties>
-</file>
-
-<file path=docProps\custom.xml><?xml version="1.0" encoding="utf-8"?>
-<Properties xmlns="http://schemas.openxmlformats.org/officeDocument/2006/custom-properties" xmlns:vt="http://schemas.openxmlformats.org/officeDocument/2006/docPropsVTypes">
-  <property fmtid="{D5CDD505-2E9C-101B-9397-08002B2CF9AE}" pid="2" name="Business Objects Context Information">
-    <vt:lpwstr>01C2D35AF44DC8546069FCCFAB82437E8ACBADAC4DA8C9ECB7A0F52D2EE4E0E3C8DC0ACB64F953634758AEA398DED891ECCC9EB45D3F9869637195F1273E2DC1A7A299B99D15BB02862A9A135A2F4920FFB10334F98B103305335A354338FDEAA4A6BF7668DB61C8BF2D03F912ECF562239AEA0F7CB88BC136C10106C1CA8C7</vt:lpwstr>
-  </property>
-  <property fmtid="{D5CDD505-2E9C-101B-9397-08002B2CF9AE}" pid="3" name="Business Objects Context Information1">
-    <vt:lpwstr>EF9E452DD9EBA44ED66BE267077035411A4ABA2F153B00825EDA35D902F2B3320556A87888A86381591F7651DCAFA6AD342A8C68A1E88CF404CDFD3A72A6FAE592EC7064E01B97567AD522926841440D4C0229E552E15332FB4E7B9E51DA4313481CBB5E1F456F58B934CE85E0A8B2E625F</vt:lpwstr>
-  </property>
-</Properties>
-</file>
-
-<file path=word\document.xml><?xml version="1.0" encoding="utf-8"?>
+<file path=word/document.xml><?xml version="1.0" encoding="utf-8"?>
 <w:document xmlns:wpc="http://schemas.microsoft.com/office/word/2010/wordprocessingCanvas" xmlns:cx="http://schemas.microsoft.com/office/drawing/2014/chartex" xmlns:cx1="http://schemas.microsoft.com/office/drawing/2015/9/8/chartex" xmlns:cx2="http://schemas.microsoft.com/office/drawing/2015/10/21/chartex" xmlns:cx3="http://schemas.microsoft.com/office/drawing/2016/5/9/chartex" xmlns:cx4="http://schemas.microsoft.com/office/drawing/2016/5/10/chartex" xmlns:cx5="http://schemas.microsoft.com/office/drawing/2016/5/11/chartex" xmlns:cx6="http://schemas.microsoft.com/office/drawing/2016/5/12/chartex" xmlns:cx7="http://schemas.microsoft.com/office/drawing/2016/5/13/chartex" xmlns:cx8="http://schemas.microsoft.com/office/drawing/2016/5/14/chartex" xmlns:mc="http://schemas.openxmlformats.org/markup-compatibility/2006" xmlns:aink="http://schemas.microsoft.com/office/drawing/2016/ink" xmlns:am3d="http://schemas.microsoft.com/office/drawing/2017/model3d" xmlns:o="urn:schemas-microsoft-com:office:office" xmlns:oel="http://schemas.microsoft.com/office/2019/extlst" xmlns:r="http://schemas.openxmlformats.org/officeDocument/2006/relationships" xmlns:m="http://schemas.openxmlformats.org/officeDocument/2006/math" xmlns:v="urn:schemas-microsoft-com:vml" xmlns:wp14="http://schemas.microsoft.com/office/word/2010/wordprocessingDrawing" xmlns:wp="http://schemas.openxmlformats.org/drawingml/2006/wordprocessingDrawing" xmlns:w10="urn:schemas-microsoft-com:office:word" xmlns:w="http://schemas.openxmlformats.org/wordprocessingml/2006/main" xmlns:w14="http://schemas.microsoft.com/office/word/2010/wordml" xmlns:w15="http://schemas.microsoft.com/office/word/2012/wordml" xmlns:w16cex="http://schemas.microsoft.com/office/word/2018/wordml/cex" xmlns:w16cid="http://schemas.microsoft.com/office/word/2016/wordml/cid" xmlns:w16="http://schemas.microsoft.com/office/word/2018/wordml" xmlns:w16sdtdh="http://schemas.microsoft.com/office/word/2020/wordml/sdtdatahash" xmlns:w16se="http://schemas.microsoft.com/office/word/2015/wordml/symex" xmlns:wpg="http://schemas.microsoft.com/office/word/2010/wordprocessingGroup" xmlns:wpi="http://schemas.microsoft.com/office/word/2010/wordprocessingInk" xmlns:wne="http://schemas.microsoft.com/office/word/2006/wordml" xmlns:wps="http://schemas.microsoft.com/office/word/2010/wordprocessingShape" mc:Ignorable="w14 w15 w16se w16cid w16 w16cex w16sdtdh wp14">
   <w:body>
     <w:p>
@@ -5546,148 +5500,7 @@
 </w:document>
 </file>
 
-<file path=word\fontTable.xml><?xml version="1.0" encoding="utf-8"?>
-<w:fonts xmlns:mc="http://schemas.openxmlformats.org/markup-compatibility/2006" xmlns:r="http://schemas.openxmlformats.org/officeDocument/2006/relationships" xmlns:w="http://schemas.openxmlformats.org/wordprocessingml/2006/main" xmlns:w14="http://schemas.microsoft.com/office/word/2010/wordml" xmlns:w15="http://schemas.microsoft.com/office/word/2012/wordml" xmlns:w16cex="http://schemas.microsoft.com/office/word/2018/wordml/cex" xmlns:w16cid="http://schemas.microsoft.com/office/word/2016/wordml/cid" xmlns:w16="http://schemas.microsoft.com/office/word/2018/wordml" xmlns:w16sdtdh="http://schemas.microsoft.com/office/word/2020/wordml/sdtdatahash" xmlns:w16se="http://schemas.microsoft.com/office/word/2015/wordml/symex" mc:Ignorable="w14 w15 w16se w16cid w16 w16cex w16sdtdh">
-  <w:font w:name="Calibri">
-    <w:panose1 w:val="020F0502020204030204"/>
-    <w:charset w:val="00"/>
-    <w:family w:val="swiss"/>
-    <w:pitch w:val="variable"/>
-    <w:sig w:usb0="E4002EFF" w:usb1="C200247B" w:usb2="00000009" w:usb3="00000000" w:csb0="000001FF" w:csb1="00000000"/>
-  </w:font>
-  <w:font w:name="Malgun Gothic">
-    <w:altName w:val="맑은 고딕"/>
-    <w:panose1 w:val="020B0503020000020004"/>
-    <w:charset w:val="81"/>
-    <w:family w:val="swiss"/>
-    <w:pitch w:val="variable"/>
-    <w:sig w:usb0="9000002F" w:usb1="29D77CFB" w:usb2="00000012" w:usb3="00000000" w:csb0="00080001" w:csb1="00000000"/>
-  </w:font>
-  <w:font w:name="Times New Roman">
-    <w:panose1 w:val="02020603050405020304"/>
-    <w:charset w:val="00"/>
-    <w:family w:val="roman"/>
-    <w:pitch w:val="variable"/>
-    <w:sig w:usb0="E0002EFF" w:usb1="C000785B" w:usb2="00000009" w:usb3="00000000" w:csb0="000001FF" w:csb1="00000000"/>
-  </w:font>
-  <w:font w:name="Arial">
-    <w:panose1 w:val="020B0604020202020204"/>
-    <w:charset w:val="00"/>
-    <w:family w:val="swiss"/>
-    <w:pitch w:val="variable"/>
-    <w:sig w:usb0="E0002EFF" w:usb1="C000785B" w:usb2="00000009" w:usb3="00000000" w:csb0="000001FF" w:csb1="00000000"/>
-  </w:font>
-  <w:font w:name="Arial Narrow">
-    <w:panose1 w:val="020B0606020202030204"/>
-    <w:charset w:val="00"/>
-    <w:family w:val="swiss"/>
-    <w:pitch w:val="variable"/>
-    <w:sig w:usb0="00000287" w:usb1="00000800" w:usb2="00000000" w:usb3="00000000" w:csb0="0000009F" w:csb1="00000000"/>
-  </w:font>
-  <w:font w:name="Calibri Light">
-    <w:panose1 w:val="020F0302020204030204"/>
-    <w:charset w:val="00"/>
-    <w:family w:val="swiss"/>
-    <w:pitch w:val="variable"/>
-    <w:sig w:usb0="E4002EFF" w:usb1="C200247B" w:usb2="00000009" w:usb3="00000000" w:csb0="000001FF" w:csb1="00000000"/>
-  </w:font>
-</w:fonts>
-</file>
-
-<file path=word\settings.xml><?xml version="1.0" encoding="utf-8"?>
-<w:settings xmlns:mc="http://schemas.openxmlformats.org/markup-compatibility/2006" xmlns:o="urn:schemas-microsoft-com:office:office" xmlns:r="http://schemas.openxmlformats.org/officeDocument/2006/relationships" xmlns:m="http://schemas.openxmlformats.org/officeDocument/2006/math" xmlns:v="urn:schemas-microsoft-com:vml" xmlns:w10="urn:schemas-microsoft-com:office:word" xmlns:w="http://schemas.openxmlformats.org/wordprocessingml/2006/main" xmlns:w14="http://schemas.microsoft.com/office/word/2010/wordml" xmlns:w15="http://schemas.microsoft.com/office/word/2012/wordml" xmlns:w16cex="http://schemas.microsoft.com/office/word/2018/wordml/cex" xmlns:w16cid="http://schemas.microsoft.com/office/word/2016/wordml/cid" xmlns:w16="http://schemas.microsoft.com/office/word/2018/wordml" xmlns:w16sdtdh="http://schemas.microsoft.com/office/word/2020/wordml/sdtdatahash" xmlns:w16se="http://schemas.microsoft.com/office/word/2015/wordml/symex" xmlns:sl="http://schemas.openxmlformats.org/schemaLibrary/2006/main" mc:Ignorable="w14 w15 w16se w16cid w16 w16cex w16sdtdh">
-  <w:zoom w:percent="100"/>
-  <w:embedSystemFonts/>
-  <w:bordersDoNotSurroundHeader/>
-  <w:bordersDoNotSurroundFooter/>
-  <w:defaultTabStop w:val="720"/>
-  <w:hyphenationZone w:val="425"/>
-  <w:drawingGridHorizontalSpacing w:val="120"/>
-  <w:drawingGridVerticalSpacing w:val="120"/>
-  <w:displayHorizontalDrawingGridEvery w:val="0"/>
-  <w:displayVerticalDrawingGridEvery w:val="3"/>
-  <w:doNotUseMarginsForDrawingGridOrigin/>
-  <w:doNotShadeFormData/>
-  <w:characterSpacingControl w:val="compressPunctuation"/>
-  <w:doNotValidateAgainstSchema/>
-  <w:doNotDemarcateInvalidXml/>
-  <w:compat>
-    <w:spaceForUL/>
-    <w:balanceSingleByteDoubleByteWidth/>
-    <w:doNotLeaveBackslashAlone/>
-    <w:ulTrailSpace/>
-    <w:doNotExpandShiftReturn/>
-    <w:footnoteLayoutLikeWW8/>
-    <w:shapeLayoutLikeWW8/>
-    <w:alignTablesRowByRow/>
-    <w:forgetLastTabAlignment/>
-    <w:adjustLineHeightInTable/>
-    <w:doNotUseHTMLParagraphAutoSpacing/>
-    <w:layoutRawTableWidth/>
-    <w:layoutTableRowsApart/>
-    <w:useWord97LineBreakRules/>
-    <w:doNotBreakWrappedTables/>
-    <w:doNotSnapToGridInCell/>
-    <w:selectFldWithFirstOrLastChar/>
-    <w:doNotWrapTextWithPunct/>
-    <w:doNotUseEastAsianBreakRules/>
-    <w:useWord2002TableStyleRules/>
-    <w:growAutofit/>
-    <w:useFELayout/>
-    <w:useNormalStyleForList/>
-    <w:doNotUseIndentAsNumberingTabStop/>
-    <w:useAltKinsokuLineBreakRules/>
-    <w:allowSpaceOfSameStyleInTable/>
-    <w:doNotSuppressIndentation/>
-    <w:doNotAutofitConstrainedTables/>
-    <w:autofitToFirstFixedWidthCell/>
-    <w:underlineTabInNumList/>
-    <w:displayHangulFixedWidth/>
-    <w:splitPgBreakAndParaMark/>
-    <w:doNotVertAlignCellWithSp/>
-    <w:doNotBreakConstrainedForcedTable/>
-    <w:doNotVertAlignInTxbx/>
-    <w:useAnsiKerningPairs/>
-    <w:cachedColBalance/>
-    <w:compatSetting w:name="compatibilityMode" w:uri="http://schemas.microsoft.com/office/word" w:val="11"/>
-    <w:compatSetting w:name="useWord2013TrackBottomHyphenation" w:uri="http://schemas.microsoft.com/office/word" w:val="0"/>
-  </w:compat>
-  <w:rsids>
-    <w:rsidRoot w:val="00B10B86"/>
-    <w:rsid w:val="00B10B86"/>
-  </w:rsids>
-  <m:mathPr>
-    <m:mathFont m:val="Cambria Math"/>
-    <m:brkBin m:val="before"/>
-    <m:brkBinSub m:val="--"/>
-    <m:smallFrac m:val="0"/>
-    <m:dispDef/>
-    <m:lMargin m:val="0"/>
-    <m:rMargin m:val="0"/>
-    <m:defJc m:val="centerGroup"/>
-    <m:wrapIndent m:val="1440"/>
-    <m:intLim m:val="subSup"/>
-    <m:naryLim m:val="undOvr"/>
-  </m:mathPr>
-  <w:themeFontLang w:val="es-NI"/>
-  <w:clrSchemeMapping w:bg1="light1" w:t1="dark1" w:bg2="light2" w:t2="dark2" w:accent1="accent1" w:accent2="accent2" w:accent3="accent3" w:accent4="accent4" w:accent5="accent5" w:accent6="accent6" w:hyperlink="hyperlink" w:followedHyperlink="followedHyperlink"/>
-  <w:doNotIncludeSubdocsInStats/>
-  <w:doNotAutoCompressPictures/>
-  <w:shapeDefaults>
-    <o:shapedefaults v:ext="edit" spidmax="1030"/>
-    <o:shapelayout v:ext="edit">
-      <o:idmap v:ext="edit" data="1"/>
-    </o:shapelayout>
-  </w:shapeDefaults>
-  <w:decimalSymbol w:val="."/>
-  <w:listSeparator w:val=";"/>
-  <w14:docId w14:val="5D6168D0"/>
-  <w14:defaultImageDpi w14:val="0"/>
-  <w15:docId w15:val="{D44C30A3-06B1-4A61-A6C1-F239045E5AB9}"/>
-</w:settings>
-</file>
-
-<file path=word\styles.xml><?xml version="1.0" encoding="utf-8"?>
+<file path=word/styles.xml><?xml version="1.0" encoding="utf-8"?>
 <w:styles xmlns:mc="http://schemas.openxmlformats.org/markup-compatibility/2006" xmlns:r="http://schemas.openxmlformats.org/officeDocument/2006/relationships" xmlns:w="http://schemas.openxmlformats.org/wordprocessingml/2006/main" xmlns:w14="http://schemas.microsoft.com/office/word/2010/wordml" xmlns:w15="http://schemas.microsoft.com/office/word/2012/wordml" xmlns:w16cex="http://schemas.microsoft.com/office/word/2018/wordml/cex" xmlns:w16cid="http://schemas.microsoft.com/office/word/2016/wordml/cid" xmlns:w16="http://schemas.microsoft.com/office/word/2018/wordml" xmlns:w16sdtdh="http://schemas.microsoft.com/office/word/2020/wordml/sdtdatahash" xmlns:w16se="http://schemas.microsoft.com/office/word/2015/wordml/symex" mc:Ignorable="w14 w15 w16se w16cid w16 w16cex w16sdtdh">
   <w:docDefaults>
     <w:rPrDefault>
@@ -6116,7 +5929,7 @@
 </w:styles>
 </file>
 
-<file path=word\theme\theme1.xml><?xml version="1.0" encoding="utf-8"?>
+<file path=word/theme/theme1.xml><?xml version="1.0" encoding="utf-8"?>
 <a:theme xmlns:a="http://schemas.openxmlformats.org/drawingml/2006/main" name="Tema de Office">
   <a:themeElements>
     <a:clrScheme name="Office">
@@ -6409,11 +6222,4 @@
     </a:ext>
   </a:extLst>
 </a:theme>
-</file>
-
-<file path=word\webSettings.xml><?xml version="1.0" encoding="utf-8"?>
-<w:webSettings xmlns:mc="http://schemas.openxmlformats.org/markup-compatibility/2006" xmlns:r="http://schemas.openxmlformats.org/officeDocument/2006/relationships" xmlns:w="http://schemas.openxmlformats.org/wordprocessingml/2006/main" xmlns:w14="http://schemas.microsoft.com/office/word/2010/wordml" xmlns:w15="http://schemas.microsoft.com/office/word/2012/wordml" xmlns:w16cex="http://schemas.microsoft.com/office/word/2018/wordml/cex" xmlns:w16cid="http://schemas.microsoft.com/office/word/2016/wordml/cid" xmlns:w16="http://schemas.microsoft.com/office/word/2018/wordml" xmlns:w16sdtdh="http://schemas.microsoft.com/office/word/2020/wordml/sdtdatahash" xmlns:w16se="http://schemas.microsoft.com/office/word/2015/wordml/symex" mc:Ignorable="w14 w15 w16se w16cid w16 w16cex w16sdtdh">
-  <w:optimizeForBrowser/>
-  <w:allowPNG/>
-</w:webSettings>
 </file>
</xml_diff>